<commit_message>
bug: Fix packaged app crashing on launch from an unhandled open() spawn error
server.js unconditionally called require('open')(...) in packaged
builds with no error handling. open's non-wait spawn path attaches no
'error' listener, so on any machine lacking a resolvable browser
opener on PATH (confirmed via pkg's own build warning that it can't
embed node_modules/open/xdg-open), the async spawn failure crashed
the whole process moments after it started listening. Wrap the call
so a failed/missing opener degrades to "no browser tab" instead of
killing the server.

Also folds in a few pending local fixes: guard day/inning inputs
against non-numeric values in standingsApi and gameApi, await the
team-roster update in the player cascade-delete so it isn't
fire-and-forget, and drop a dead unused variable in draftApi.
</commit_message>
<xml_diff>
--- a/docs/scouting-report-card.docx
+++ b/docs/scouting-report-card.docx
@@ -1,6 +1,6 @@
 
 <file path=word/document.xml><?xml version="1.0" encoding="utf-8"?>
-<w:document xmlns:o="urn:schemas-microsoft-com:office:office" xmlns:r="http://schemas.openxmlformats.org/officeDocument/2006/relationships" xmlns:v="urn:schemas-microsoft-com:vml" xmlns:w="http://schemas.openxmlformats.org/wordprocessingml/2006/main" xmlns:w10="urn:schemas-microsoft-com:office:word" xmlns:wp="http://schemas.openxmlformats.org/drawingml/2006/wordprocessingDrawing" xmlns:wps="http://schemas.microsoft.com/office/word/2010/wordprocessingShape" xmlns:wpg="http://schemas.microsoft.com/office/word/2010/wordprocessingGroup" xmlns:mc="http://schemas.openxmlformats.org/markup-compatibility/2006" xmlns:wp14="http://schemas.microsoft.com/office/word/2010/wordprocessingDrawing" xmlns:w14="http://schemas.microsoft.com/office/word/2010/wordml" xmlns:w15="http://schemas.microsoft.com/office/word/2012/wordml" mc:Ignorable="w14 wp14 w15">
+<w:document xmlns:o="urn:schemas-microsoft-com:office:office" xmlns:r="http://schemas.openxmlformats.org/officeDocument/2006/relationships" xmlns:v="urn:schemas-microsoft-com:vml" xmlns:w="http://schemas.openxmlformats.org/wordprocessingml/2006/main" xmlns:w10="urn:schemas-microsoft-com:office:word" xmlns:wp="http://schemas.openxmlformats.org/drawingml/2006/wordprocessingDrawing" xmlns:pic="http://schemas.openxmlformats.org/drawingml/2006/picture" xmlns:wps="http://schemas.microsoft.com/office/word/2010/wordprocessingShape" xmlns:wpg="http://schemas.microsoft.com/office/word/2010/wordprocessingGroup" xmlns:mc="http://schemas.openxmlformats.org/markup-compatibility/2006" xmlns:wp14="http://schemas.microsoft.com/office/word/2010/wordprocessingDrawing" xmlns:w14="http://schemas.microsoft.com/office/word/2010/wordml" xmlns:w15="http://schemas.microsoft.com/office/word/2012/wordml" mc:Ignorable="w14 wp14 w15">
   <w:body>
     <w:tbl>
       <w:tblPr>
@@ -16,14 +16,14 @@
         </w:tblCellMar>
       </w:tblPr>
       <w:tblGrid>
-        <w:gridCol w:w="1599"/>
-        <w:gridCol w:w="8480"/>
+        <w:gridCol w:w="1598"/>
+        <w:gridCol w:w="8482"/>
       </w:tblGrid>
       <w:tr>
         <w:trPr/>
         <w:tc>
           <w:tcPr>
-            <w:tcW w:w="1599" w:type="dxa"/>
+            <w:tcW w:w="1598" w:type="dxa"/>
             <w:tcBorders>
               <w:top w:val="single" w:sz="4" w:space="0" w:color="114566"/>
               <w:left w:val="single" w:sz="4" w:space="0" w:color="114566"/>
@@ -46,7 +46,7 @@
                 <wp:inline distT="0" distB="0" distL="0" distR="0">
                   <wp:extent cx="850265" cy="850265"/>
                   <wp:effectExtent l="0" t="0" r="0" b="0"/>
-                  <wp:docPr id="1" name="Logo" descr=""/>
+                  <wp:docPr id="1" name="Logo"/>
                   <wp:cNvGraphicFramePr>
                     <a:graphicFrameLocks xmlns:a="http://schemas.openxmlformats.org/drawingml/2006/main" noChangeAspect="1"/>
                   </wp:cNvGraphicFramePr>
@@ -54,7 +54,7 @@
                     <a:graphicData uri="http://schemas.openxmlformats.org/drawingml/2006/picture">
                       <pic:pic xmlns:pic="http://schemas.openxmlformats.org/drawingml/2006/picture">
                         <pic:nvPicPr>
-                          <pic:cNvPr id="1" name="Logo" descr=""/>
+                          <pic:cNvPr id="1" name="Logo"/>
                           <pic:cNvPicPr>
                             <a:picLocks noChangeAspect="1" noChangeArrowheads="1"/>
                           </pic:cNvPicPr>
@@ -73,6 +73,7 @@
                           <a:prstGeom prst="rect">
                             <a:avLst/>
                           </a:prstGeom>
+                          <a:noFill/>
                         </pic:spPr>
                       </pic:pic>
                     </a:graphicData>
@@ -84,7 +85,7 @@
         </w:tc>
         <w:tc>
           <w:tcPr>
-            <w:tcW w:w="8480" w:type="dxa"/>
+            <w:tcW w:w="8482" w:type="dxa"/>
             <w:tcBorders>
               <w:top w:val="single" w:sz="4" w:space="0" w:color="114566"/>
               <w:left w:val="single" w:sz="4" w:space="0" w:color="114566"/>
@@ -205,7 +206,7 @@
         <w:gridCol w:w="3780"/>
         <w:gridCol w:w="1999"/>
         <w:gridCol w:w="2150"/>
-        <w:gridCol w:w="2150"/>
+        <w:gridCol w:w="2151"/>
       </w:tblGrid>
       <w:tr>
         <w:trPr/>
@@ -238,14 +239,13 @@
             <w:pPr>
               <w:pStyle w:val="Normal"/>
               <w:spacing w:before="120" w:after="0"/>
-              <w:rPr/>
-            </w:pPr>
-            <w:r>
               <w:rPr>
                 <w:sz w:val="22"/>
                 <w:szCs w:val="22"/>
               </w:rPr>
-              <w:t xml:space="preserve"> </w:t>
+            </w:pPr>
+            <w:r>
+              <w:rPr/>
             </w:r>
           </w:p>
         </w:tc>
@@ -278,14 +278,13 @@
             <w:pPr>
               <w:pStyle w:val="Normal"/>
               <w:spacing w:before="120" w:after="0"/>
-              <w:rPr/>
-            </w:pPr>
-            <w:r>
               <w:rPr>
                 <w:sz w:val="22"/>
                 <w:szCs w:val="22"/>
               </w:rPr>
-              <w:t xml:space="preserve"> </w:t>
+            </w:pPr>
+            <w:r>
+              <w:rPr/>
             </w:r>
           </w:p>
         </w:tc>
@@ -318,20 +317,19 @@
             <w:pPr>
               <w:pStyle w:val="Normal"/>
               <w:spacing w:before="120" w:after="0"/>
-              <w:rPr/>
-            </w:pPr>
-            <w:r>
               <w:rPr>
                 <w:sz w:val="22"/>
                 <w:szCs w:val="22"/>
               </w:rPr>
-              <w:t xml:space="preserve"> </w:t>
-            </w:r>
-          </w:p>
-        </w:tc>
-        <w:tc>
-          <w:tcPr>
-            <w:tcW w:w="2150" w:type="dxa"/>
+            </w:pPr>
+            <w:r>
+              <w:rPr/>
+            </w:r>
+          </w:p>
+        </w:tc>
+        <w:tc>
+          <w:tcPr>
+            <w:tcW w:w="2151" w:type="dxa"/>
             <w:tcBorders>
               <w:bottom w:val="single" w:sz="8" w:space="0" w:color="114566"/>
             </w:tcBorders>
@@ -358,14 +356,13 @@
             <w:pPr>
               <w:pStyle w:val="Normal"/>
               <w:spacing w:before="120" w:after="0"/>
-              <w:rPr/>
-            </w:pPr>
-            <w:r>
               <w:rPr>
                 <w:sz w:val="22"/>
                 <w:szCs w:val="22"/>
               </w:rPr>
-              <w:t xml:space="preserve"> </w:t>
+            </w:pPr>
+            <w:r>
+              <w:rPr/>
             </w:r>
           </w:p>
         </w:tc>
@@ -400,14 +397,14 @@
         <w:gridCol w:w="1181"/>
         <w:gridCol w:w="1180"/>
         <w:gridCol w:w="1179"/>
-        <w:gridCol w:w="2051"/>
+        <w:gridCol w:w="2052"/>
         <w:gridCol w:w="2129"/>
       </w:tblGrid>
       <w:tr>
         <w:trPr/>
         <w:tc>
           <w:tcPr>
-            <w:tcW w:w="10079" w:type="dxa"/>
+            <w:tcW w:w="10080" w:type="dxa"/>
             <w:gridSpan w:val="7"/>
             <w:tcBorders>
               <w:top w:val="single" w:sz="4" w:space="0" w:color="114566"/>
@@ -459,7 +456,7 @@
         <w:trPr/>
         <w:tc>
           <w:tcPr>
-            <w:tcW w:w="10079" w:type="dxa"/>
+            <w:tcW w:w="10080" w:type="dxa"/>
             <w:gridSpan w:val="7"/>
             <w:tcBorders>
               <w:top w:val="single" w:sz="4" w:space="0" w:color="196A73"/>
@@ -681,7 +678,7 @@
         </w:tc>
         <w:tc>
           <w:tcPr>
-            <w:tcW w:w="2051" w:type="dxa"/>
+            <w:tcW w:w="2052" w:type="dxa"/>
             <w:tcBorders>
               <w:top w:val="single" w:sz="4" w:space="0" w:color="F28F16"/>
               <w:left w:val="single" w:sz="4" w:space="0" w:color="F28F16"/>
@@ -779,14 +776,13 @@
             <w:pPr>
               <w:pStyle w:val="Normal"/>
               <w:jc w:val="center"/>
-              <w:rPr/>
-            </w:pPr>
-            <w:r>
               <w:rPr>
                 <w:sz w:val="24"/>
                 <w:szCs w:val="24"/>
               </w:rPr>
-              <w:t xml:space="preserve"> </w:t>
+            </w:pPr>
+            <w:r>
+              <w:rPr/>
             </w:r>
           </w:p>
         </w:tc>
@@ -811,14 +807,13 @@
             <w:pPr>
               <w:pStyle w:val="Normal"/>
               <w:jc w:val="center"/>
-              <w:rPr/>
-            </w:pPr>
-            <w:r>
               <w:rPr>
                 <w:sz w:val="24"/>
                 <w:szCs w:val="24"/>
               </w:rPr>
-              <w:t xml:space="preserve"> </w:t>
+            </w:pPr>
+            <w:r>
+              <w:rPr/>
             </w:r>
           </w:p>
         </w:tc>
@@ -843,14 +838,13 @@
             <w:pPr>
               <w:pStyle w:val="Normal"/>
               <w:jc w:val="center"/>
-              <w:rPr/>
-            </w:pPr>
-            <w:r>
               <w:rPr>
                 <w:sz w:val="24"/>
                 <w:szCs w:val="24"/>
               </w:rPr>
-              <w:t xml:space="preserve"> </w:t>
+            </w:pPr>
+            <w:r>
+              <w:rPr/>
             </w:r>
           </w:p>
         </w:tc>
@@ -875,14 +869,13 @@
             <w:pPr>
               <w:pStyle w:val="Normal"/>
               <w:jc w:val="center"/>
-              <w:rPr/>
-            </w:pPr>
-            <w:r>
               <w:rPr>
                 <w:sz w:val="24"/>
                 <w:szCs w:val="24"/>
               </w:rPr>
-              <w:t xml:space="preserve"> </w:t>
+            </w:pPr>
+            <w:r>
+              <w:rPr/>
             </w:r>
           </w:p>
         </w:tc>
@@ -907,20 +900,19 @@
             <w:pPr>
               <w:pStyle w:val="Normal"/>
               <w:jc w:val="center"/>
-              <w:rPr/>
-            </w:pPr>
-            <w:r>
               <w:rPr>
                 <w:sz w:val="24"/>
                 <w:szCs w:val="24"/>
               </w:rPr>
-              <w:t xml:space="preserve"> </w:t>
-            </w:r>
-          </w:p>
-        </w:tc>
-        <w:tc>
-          <w:tcPr>
-            <w:tcW w:w="2051" w:type="dxa"/>
+            </w:pPr>
+            <w:r>
+              <w:rPr/>
+            </w:r>
+          </w:p>
+        </w:tc>
+        <w:tc>
+          <w:tcPr>
+            <w:tcW w:w="2052" w:type="dxa"/>
             <w:tcBorders>
               <w:top w:val="single" w:sz="4" w:space="0" w:color="F28F16"/>
               <w:left w:val="single" w:sz="4" w:space="0" w:color="F28F16"/>
@@ -939,14 +931,13 @@
             <w:pPr>
               <w:pStyle w:val="Normal"/>
               <w:jc w:val="center"/>
-              <w:rPr/>
-            </w:pPr>
-            <w:r>
               <w:rPr>
                 <w:sz w:val="24"/>
                 <w:szCs w:val="24"/>
               </w:rPr>
-              <w:t xml:space="preserve"> </w:t>
+            </w:pPr>
+            <w:r>
+              <w:rPr/>
             </w:r>
           </w:p>
         </w:tc>
@@ -971,14 +962,13 @@
             <w:pPr>
               <w:pStyle w:val="Normal"/>
               <w:jc w:val="center"/>
-              <w:rPr/>
-            </w:pPr>
-            <w:r>
               <w:rPr>
                 <w:sz w:val="24"/>
                 <w:szCs w:val="24"/>
               </w:rPr>
-              <w:t xml:space="preserve"> </w:t>
+            </w:pPr>
+            <w:r>
+              <w:rPr/>
             </w:r>
           </w:p>
         </w:tc>
@@ -1013,14 +1003,14 @@
         <w:gridCol w:w="1181"/>
         <w:gridCol w:w="1180"/>
         <w:gridCol w:w="1179"/>
-        <w:gridCol w:w="2051"/>
+        <w:gridCol w:w="2052"/>
         <w:gridCol w:w="2129"/>
       </w:tblGrid>
       <w:tr>
         <w:trPr/>
         <w:tc>
           <w:tcPr>
-            <w:tcW w:w="10079" w:type="dxa"/>
+            <w:tcW w:w="10080" w:type="dxa"/>
             <w:gridSpan w:val="7"/>
             <w:tcBorders>
               <w:top w:val="single" w:sz="4" w:space="0" w:color="114566"/>
@@ -1072,7 +1062,7 @@
         <w:trPr/>
         <w:tc>
           <w:tcPr>
-            <w:tcW w:w="10079" w:type="dxa"/>
+            <w:tcW w:w="10080" w:type="dxa"/>
             <w:gridSpan w:val="7"/>
             <w:tcBorders>
               <w:top w:val="single" w:sz="4" w:space="0" w:color="196A73"/>
@@ -1294,7 +1284,7 @@
         </w:tc>
         <w:tc>
           <w:tcPr>
-            <w:tcW w:w="2051" w:type="dxa"/>
+            <w:tcW w:w="2052" w:type="dxa"/>
             <w:tcBorders>
               <w:top w:val="single" w:sz="4" w:space="0" w:color="F28F16"/>
               <w:left w:val="single" w:sz="4" w:space="0" w:color="F28F16"/>
@@ -1392,14 +1382,13 @@
             <w:pPr>
               <w:pStyle w:val="Normal"/>
               <w:jc w:val="center"/>
-              <w:rPr/>
-            </w:pPr>
-            <w:r>
               <w:rPr>
                 <w:sz w:val="24"/>
                 <w:szCs w:val="24"/>
               </w:rPr>
-              <w:t xml:space="preserve"> </w:t>
+            </w:pPr>
+            <w:r>
+              <w:rPr/>
             </w:r>
           </w:p>
         </w:tc>
@@ -1424,14 +1413,13 @@
             <w:pPr>
               <w:pStyle w:val="Normal"/>
               <w:jc w:val="center"/>
-              <w:rPr/>
-            </w:pPr>
-            <w:r>
               <w:rPr>
                 <w:sz w:val="24"/>
                 <w:szCs w:val="24"/>
               </w:rPr>
-              <w:t xml:space="preserve"> </w:t>
+            </w:pPr>
+            <w:r>
+              <w:rPr/>
             </w:r>
           </w:p>
         </w:tc>
@@ -1456,14 +1444,13 @@
             <w:pPr>
               <w:pStyle w:val="Normal"/>
               <w:jc w:val="center"/>
-              <w:rPr/>
-            </w:pPr>
-            <w:r>
               <w:rPr>
                 <w:sz w:val="24"/>
                 <w:szCs w:val="24"/>
               </w:rPr>
-              <w:t xml:space="preserve"> </w:t>
+            </w:pPr>
+            <w:r>
+              <w:rPr/>
             </w:r>
           </w:p>
         </w:tc>
@@ -1488,14 +1475,13 @@
             <w:pPr>
               <w:pStyle w:val="Normal"/>
               <w:jc w:val="center"/>
-              <w:rPr/>
-            </w:pPr>
-            <w:r>
               <w:rPr>
                 <w:sz w:val="24"/>
                 <w:szCs w:val="24"/>
               </w:rPr>
-              <w:t xml:space="preserve"> </w:t>
+            </w:pPr>
+            <w:r>
+              <w:rPr/>
             </w:r>
           </w:p>
         </w:tc>
@@ -1520,20 +1506,19 @@
             <w:pPr>
               <w:pStyle w:val="Normal"/>
               <w:jc w:val="center"/>
-              <w:rPr/>
-            </w:pPr>
-            <w:r>
               <w:rPr>
                 <w:sz w:val="24"/>
                 <w:szCs w:val="24"/>
               </w:rPr>
-              <w:t xml:space="preserve"> </w:t>
-            </w:r>
-          </w:p>
-        </w:tc>
-        <w:tc>
-          <w:tcPr>
-            <w:tcW w:w="2051" w:type="dxa"/>
+            </w:pPr>
+            <w:r>
+              <w:rPr/>
+            </w:r>
+          </w:p>
+        </w:tc>
+        <w:tc>
+          <w:tcPr>
+            <w:tcW w:w="2052" w:type="dxa"/>
             <w:tcBorders>
               <w:top w:val="single" w:sz="4" w:space="0" w:color="F28F16"/>
               <w:left w:val="single" w:sz="4" w:space="0" w:color="F28F16"/>
@@ -1552,14 +1537,13 @@
             <w:pPr>
               <w:pStyle w:val="Normal"/>
               <w:jc w:val="center"/>
-              <w:rPr/>
-            </w:pPr>
-            <w:r>
               <w:rPr>
                 <w:sz w:val="24"/>
                 <w:szCs w:val="24"/>
               </w:rPr>
-              <w:t xml:space="preserve"> </w:t>
+            </w:pPr>
+            <w:r>
+              <w:rPr/>
             </w:r>
           </w:p>
         </w:tc>
@@ -1584,14 +1568,13 @@
             <w:pPr>
               <w:pStyle w:val="Normal"/>
               <w:jc w:val="center"/>
-              <w:rPr/>
-            </w:pPr>
-            <w:r>
               <w:rPr>
                 <w:sz w:val="24"/>
                 <w:szCs w:val="24"/>
               </w:rPr>
-              <w:t xml:space="preserve"> </w:t>
+            </w:pPr>
+            <w:r>
+              <w:rPr/>
             </w:r>
           </w:p>
         </w:tc>
@@ -1626,14 +1609,14 @@
         <w:gridCol w:w="1181"/>
         <w:gridCol w:w="1180"/>
         <w:gridCol w:w="1179"/>
-        <w:gridCol w:w="2051"/>
+        <w:gridCol w:w="2052"/>
         <w:gridCol w:w="2129"/>
       </w:tblGrid>
       <w:tr>
         <w:trPr/>
         <w:tc>
           <w:tcPr>
-            <w:tcW w:w="10079" w:type="dxa"/>
+            <w:tcW w:w="10080" w:type="dxa"/>
             <w:gridSpan w:val="7"/>
             <w:tcBorders>
               <w:top w:val="single" w:sz="4" w:space="0" w:color="114566"/>
@@ -1685,7 +1668,7 @@
         <w:trPr/>
         <w:tc>
           <w:tcPr>
-            <w:tcW w:w="10079" w:type="dxa"/>
+            <w:tcW w:w="10080" w:type="dxa"/>
             <w:gridSpan w:val="7"/>
             <w:tcBorders>
               <w:top w:val="single" w:sz="4" w:space="0" w:color="196A73"/>
@@ -1907,7 +1890,7 @@
         </w:tc>
         <w:tc>
           <w:tcPr>
-            <w:tcW w:w="2051" w:type="dxa"/>
+            <w:tcW w:w="2052" w:type="dxa"/>
             <w:tcBorders>
               <w:top w:val="single" w:sz="4" w:space="0" w:color="F28F16"/>
               <w:left w:val="single" w:sz="4" w:space="0" w:color="F28F16"/>
@@ -2005,14 +1988,13 @@
             <w:pPr>
               <w:pStyle w:val="Normal"/>
               <w:jc w:val="center"/>
-              <w:rPr/>
-            </w:pPr>
-            <w:r>
               <w:rPr>
                 <w:sz w:val="24"/>
                 <w:szCs w:val="24"/>
               </w:rPr>
-              <w:t xml:space="preserve"> </w:t>
+            </w:pPr>
+            <w:r>
+              <w:rPr/>
             </w:r>
           </w:p>
         </w:tc>
@@ -2037,14 +2019,13 @@
             <w:pPr>
               <w:pStyle w:val="Normal"/>
               <w:jc w:val="center"/>
-              <w:rPr/>
-            </w:pPr>
-            <w:r>
               <w:rPr>
                 <w:sz w:val="24"/>
                 <w:szCs w:val="24"/>
               </w:rPr>
-              <w:t xml:space="preserve"> </w:t>
+            </w:pPr>
+            <w:r>
+              <w:rPr/>
             </w:r>
           </w:p>
         </w:tc>
@@ -2069,14 +2050,13 @@
             <w:pPr>
               <w:pStyle w:val="Normal"/>
               <w:jc w:val="center"/>
-              <w:rPr/>
-            </w:pPr>
-            <w:r>
               <w:rPr>
                 <w:sz w:val="24"/>
                 <w:szCs w:val="24"/>
               </w:rPr>
-              <w:t xml:space="preserve"> </w:t>
+            </w:pPr>
+            <w:r>
+              <w:rPr/>
             </w:r>
           </w:p>
         </w:tc>
@@ -2101,14 +2081,13 @@
             <w:pPr>
               <w:pStyle w:val="Normal"/>
               <w:jc w:val="center"/>
-              <w:rPr/>
-            </w:pPr>
-            <w:r>
               <w:rPr>
                 <w:sz w:val="24"/>
                 <w:szCs w:val="24"/>
               </w:rPr>
-              <w:t xml:space="preserve"> </w:t>
+            </w:pPr>
+            <w:r>
+              <w:rPr/>
             </w:r>
           </w:p>
         </w:tc>
@@ -2133,20 +2112,19 @@
             <w:pPr>
               <w:pStyle w:val="Normal"/>
               <w:jc w:val="center"/>
-              <w:rPr/>
-            </w:pPr>
-            <w:r>
               <w:rPr>
                 <w:sz w:val="24"/>
                 <w:szCs w:val="24"/>
               </w:rPr>
-              <w:t xml:space="preserve"> </w:t>
-            </w:r>
-          </w:p>
-        </w:tc>
-        <w:tc>
-          <w:tcPr>
-            <w:tcW w:w="2051" w:type="dxa"/>
+            </w:pPr>
+            <w:r>
+              <w:rPr/>
+            </w:r>
+          </w:p>
+        </w:tc>
+        <w:tc>
+          <w:tcPr>
+            <w:tcW w:w="2052" w:type="dxa"/>
             <w:tcBorders>
               <w:top w:val="single" w:sz="4" w:space="0" w:color="F28F16"/>
               <w:left w:val="single" w:sz="4" w:space="0" w:color="F28F16"/>
@@ -2165,14 +2143,13 @@
             <w:pPr>
               <w:pStyle w:val="Normal"/>
               <w:jc w:val="center"/>
-              <w:rPr/>
-            </w:pPr>
-            <w:r>
               <w:rPr>
                 <w:sz w:val="24"/>
                 <w:szCs w:val="24"/>
               </w:rPr>
-              <w:t xml:space="preserve"> </w:t>
+            </w:pPr>
+            <w:r>
+              <w:rPr/>
             </w:r>
           </w:p>
         </w:tc>
@@ -2197,14 +2174,13 @@
             <w:pPr>
               <w:pStyle w:val="Normal"/>
               <w:jc w:val="center"/>
-              <w:rPr/>
-            </w:pPr>
-            <w:r>
               <w:rPr>
                 <w:sz w:val="24"/>
                 <w:szCs w:val="24"/>
               </w:rPr>
-              <w:t xml:space="preserve"> </w:t>
+            </w:pPr>
+            <w:r>
+              <w:rPr/>
             </w:r>
           </w:p>
         </w:tc>
@@ -2256,7 +2232,6 @@
               <w:rPr>
                 <w:rFonts w:ascii="Arial" w:hAnsi="Arial" w:eastAsia="Arial" w:cs="Arial"/>
                 <w:i/>
-                <w:i/>
                 <w:iCs/>
                 <w:color w:val="FFFFFF"/>
                 <w:sz w:val="14"/>
@@ -2300,14 +2275,13 @@
             <w:pPr>
               <w:pStyle w:val="Normal"/>
               <w:jc w:val="center"/>
-              <w:rPr/>
-            </w:pPr>
-            <w:r>
               <w:rPr>
                 <w:sz w:val="48"/>
                 <w:szCs w:val="48"/>
               </w:rPr>
-              <w:t xml:space="preserve"> </w:t>
+            </w:pPr>
+            <w:r>
+              <w:rPr/>
             </w:r>
           </w:p>
         </w:tc>
@@ -2317,114 +2291,6 @@
       <w:pPr>
         <w:pStyle w:val="Normal"/>
         <w:spacing w:before="100" w:after="0"/>
-        <w:rPr/>
-      </w:pPr>
-      <w:r>
-        <w:rPr/>
-      </w:r>
-    </w:p>
-    <w:tbl>
-      <w:tblPr>
-        <w:tblW w:w="10080" w:type="dxa"/>
-        <w:jc w:val="left"/>
-        <w:tblInd w:w="0" w:type="dxa"/>
-        <w:tblLayout w:type="fixed"/>
-        <w:tblCellMar>
-          <w:top w:w="80" w:type="dxa"/>
-          <w:left w:w="200" w:type="dxa"/>
-          <w:bottom w:w="80" w:type="dxa"/>
-          <w:right w:w="200" w:type="dxa"/>
-        </w:tblCellMar>
-      </w:tblPr>
-      <w:tblGrid>
-        <w:gridCol w:w="10080"/>
-      </w:tblGrid>
-      <w:tr>
-        <w:trPr/>
-        <w:tc>
-          <w:tcPr>
-            <w:tcW w:w="10080" w:type="dxa"/>
-            <w:tcBorders>
-              <w:top w:val="single" w:sz="4" w:space="0" w:color="196A73"/>
-              <w:left w:val="single" w:sz="4" w:space="0" w:color="196A73"/>
-              <w:bottom w:val="single" w:sz="4" w:space="0" w:color="196A73"/>
-              <w:right w:val="single" w:sz="4" w:space="0" w:color="196A73"/>
-            </w:tcBorders>
-            <w:shd w:fill="196A73" w:val="clear"/>
-          </w:tcPr>
-          <w:p>
-            <w:pPr>
-              <w:pStyle w:val="Normal"/>
-              <w:rPr/>
-            </w:pPr>
-            <w:r>
-              <w:rPr>
-                <w:rFonts w:eastAsia="Arial" w:cs="Arial"/>
-                <w:b/>
-                <w:bCs/>
-                <w:color w:val="FFFFFF"/>
-                <w:spacing w:val="60"/>
-                <w:sz w:val="18"/>
-                <w:szCs w:val="18"/>
-              </w:rPr>
-              <w:t>SCOUT NOTES</w:t>
-            </w:r>
-          </w:p>
-        </w:tc>
-      </w:tr>
-      <w:tr>
-        <w:trPr>
-          <w:trHeight w:val="600" w:hRule="atLeast"/>
-        </w:trPr>
-        <w:tc>
-          <w:tcPr>
-            <w:tcW w:w="10080" w:type="dxa"/>
-            <w:tcBorders>
-              <w:left w:val="single" w:sz="4" w:space="0" w:color="999999"/>
-              <w:bottom w:val="single" w:sz="4" w:space="0" w:color="999999"/>
-              <w:right w:val="single" w:sz="4" w:space="0" w:color="999999"/>
-            </w:tcBorders>
-            <w:shd w:fill="FFFFFF" w:val="clear"/>
-            <w:tcMar>
-              <w:top w:w="100" w:type="dxa"/>
-              <w:left w:w="240" w:type="dxa"/>
-              <w:bottom w:w="100" w:type="dxa"/>
-              <w:right w:w="240" w:type="dxa"/>
-            </w:tcMar>
-          </w:tcPr>
-          <w:p>
-            <w:pPr>
-              <w:pStyle w:val="Normal"/>
-              <w:rPr/>
-            </w:pPr>
-            <w:r>
-              <w:rPr>
-                <w:sz w:val="22"/>
-                <w:szCs w:val="22"/>
-              </w:rPr>
-              <w:t xml:space="preserve"> </w:t>
-            </w:r>
-          </w:p>
-          <w:p>
-            <w:pPr>
-              <w:pStyle w:val="Normal"/>
-              <w:rPr/>
-            </w:pPr>
-            <w:r>
-              <w:rPr>
-                <w:sz w:val="22"/>
-                <w:szCs w:val="22"/>
-              </w:rPr>
-              <w:t xml:space="preserve"> </w:t>
-            </w:r>
-          </w:p>
-        </w:tc>
-      </w:tr>
-    </w:tbl>
-    <w:p>
-      <w:pPr>
-        <w:pStyle w:val="Normal"/>
-        <w:spacing w:before="60" w:after="0"/>
         <w:rPr/>
       </w:pPr>
       <w:r>
@@ -2448,7 +2314,9 @@
         <w:gridCol w:w="10080"/>
       </w:tblGrid>
       <w:tr>
-        <w:trPr/>
+        <w:trPr>
+          <w:trHeight w:val="435" w:hRule="atLeast"/>
+        </w:trPr>
         <w:tc>
           <w:tcPr>
             <w:tcW w:w="10080" w:type="dxa"/>
@@ -2459,9 +2327,6 @@
           <w:p>
             <w:pPr>
               <w:pStyle w:val="Normal"/>
-              <w:rPr/>
-            </w:pPr>
-            <w:r>
               <w:rPr>
                 <w:rFonts w:eastAsia="Arial" w:cs="Arial"/>
                 <w:b/>
@@ -2471,21 +2336,43 @@
                 <w:sz w:val="14"/>
                 <w:szCs w:val="14"/>
               </w:rPr>
+            </w:pPr>
+            <w:r>
+              <w:rPr>
+                <w:rFonts w:eastAsia="Arial" w:cs="Arial"/>
+                <w:b/>
+                <w:bCs/>
+                <w:color w:val="196A73"/>
+                <w:spacing w:val="40"/>
+                <w:sz w:val="14"/>
+                <w:szCs w:val="14"/>
+              </w:rPr>
               <w:t>TEAM CAPTAIN ASSIGNED</w:t>
             </w:r>
           </w:p>
           <w:p>
             <w:pPr>
               <w:pStyle w:val="Normal"/>
-              <w:spacing w:before="120" w:after="0"/>
-              <w:rPr/>
-            </w:pPr>
-            <w:r>
-              <w:rPr>
-                <w:sz w:val="22"/>
-                <w:szCs w:val="22"/>
-              </w:rPr>
-              <w:t xml:space="preserve"> </w:t>
+              <w:rPr>
+                <w:rFonts w:eastAsia="Arial" w:cs="Arial"/>
+                <w:b/>
+                <w:bCs/>
+                <w:color w:val="196A73"/>
+                <w:spacing w:val="40"/>
+                <w:sz w:val="14"/>
+                <w:szCs w:val="14"/>
+              </w:rPr>
+            </w:pPr>
+            <w:r>
+              <w:rPr>
+                <w:rFonts w:eastAsia="Arial" w:cs="Arial"/>
+                <w:b/>
+                <w:bCs/>
+                <w:color w:val="196A73"/>
+                <w:spacing w:val="40"/>
+                <w:sz w:val="14"/>
+                <w:szCs w:val="14"/>
+              </w:rPr>
             </w:r>
           </w:p>
         </w:tc>
@@ -2587,6 +2474,7 @@
     <w:qFormat/>
     <w:pPr>
       <w:widowControl/>
+      <w:suppressAutoHyphens w:val="true"/>
       <w:bidi w:val="0"/>
       <w:spacing w:before="0" w:after="0"/>
       <w:jc w:val="left"/>
@@ -2601,7 +2489,7 @@
     </w:rPr>
   </w:style>
   <w:style w:type="paragraph" w:styleId="Heading1">
-    <w:name w:val="Heading 1"/>
+    <w:name w:val="heading 1"/>
     <w:basedOn w:val="Heading"/>
     <w:qFormat/>
     <w:pPr/>
@@ -2612,7 +2500,7 @@
     </w:rPr>
   </w:style>
   <w:style w:type="paragraph" w:styleId="Heading2">
-    <w:name w:val="Heading 2"/>
+    <w:name w:val="heading 2"/>
     <w:basedOn w:val="Heading"/>
     <w:qFormat/>
     <w:pPr/>
@@ -2623,7 +2511,7 @@
     </w:rPr>
   </w:style>
   <w:style w:type="paragraph" w:styleId="Heading3">
-    <w:name w:val="Heading 3"/>
+    <w:name w:val="heading 3"/>
     <w:basedOn w:val="Heading"/>
     <w:qFormat/>
     <w:pPr/>
@@ -2634,7 +2522,7 @@
     </w:rPr>
   </w:style>
   <w:style w:type="paragraph" w:styleId="Heading4">
-    <w:name w:val="Heading 4"/>
+    <w:name w:val="heading 4"/>
     <w:basedOn w:val="Heading"/>
     <w:qFormat/>
     <w:pPr/>
@@ -2645,7 +2533,7 @@
     </w:rPr>
   </w:style>
   <w:style w:type="paragraph" w:styleId="Heading5">
-    <w:name w:val="Heading 5"/>
+    <w:name w:val="heading 5"/>
     <w:basedOn w:val="Heading"/>
     <w:qFormat/>
     <w:pPr/>
@@ -2654,7 +2542,7 @@
     </w:rPr>
   </w:style>
   <w:style w:type="paragraph" w:styleId="Heading6">
-    <w:name w:val="Heading 6"/>
+    <w:name w:val="heading 6"/>
     <w:basedOn w:val="Heading"/>
     <w:qFormat/>
     <w:pPr/>
@@ -2671,8 +2559,8 @@
       <w:u w:val="single"/>
     </w:rPr>
   </w:style>
-  <w:style w:type="character" w:styleId="FootnoteCharacters">
-    <w:name w:val="Footnote Characters"/>
+  <w:style w:type="character" w:styleId="FootnoteCharactersuser">
+    <w:name w:val="Footnote Characters (user)"/>
     <w:uiPriority w:val="99"/>
     <w:semiHidden/>
     <w:unhideWhenUsed/>
@@ -2681,8 +2569,15 @@
       <w:vertAlign w:val="superscript"/>
     </w:rPr>
   </w:style>
+  <w:style w:type="character" w:styleId="FootnoteCharacters">
+    <w:name w:val="Footnote Characters"/>
+    <w:qFormat/>
+    <w:rPr>
+      <w:vertAlign w:val="superscript"/>
+    </w:rPr>
+  </w:style>
   <w:style w:type="character" w:styleId="FootnoteReference">
-    <w:name w:val="Footnote Reference"/>
+    <w:name w:val="footnote reference"/>
     <w:rPr>
       <w:vertAlign w:val="superscript"/>
     </w:rPr>
@@ -2699,8 +2594,8 @@
       <w:szCs w:val="20"/>
     </w:rPr>
   </w:style>
-  <w:style w:type="character" w:styleId="EndnoteCharacters">
-    <w:name w:val="Endnote Characters"/>
+  <w:style w:type="character" w:styleId="EndnoteCharactersuser">
+    <w:name w:val="Endnote Characters (user)"/>
     <w:uiPriority w:val="99"/>
     <w:semiHidden/>
     <w:unhideWhenUsed/>
@@ -2709,8 +2604,15 @@
       <w:vertAlign w:val="superscript"/>
     </w:rPr>
   </w:style>
+  <w:style w:type="character" w:styleId="EndnoteCharacters">
+    <w:name w:val="Endnote Characters"/>
+    <w:qFormat/>
+    <w:rPr>
+      <w:vertAlign w:val="superscript"/>
+    </w:rPr>
+  </w:style>
   <w:style w:type="character" w:styleId="EndnoteReference">
-    <w:name w:val="Endnote Reference"/>
+    <w:name w:val="endnote reference"/>
     <w:rPr>
       <w:vertAlign w:val="superscript"/>
     </w:rPr>
@@ -2759,7 +2661,7 @@
     </w:rPr>
   </w:style>
   <w:style w:type="paragraph" w:styleId="Caption">
-    <w:name w:val="Caption"/>
+    <w:name w:val="caption"/>
     <w:basedOn w:val="Normal"/>
     <w:qFormat/>
     <w:pPr>
@@ -2800,6 +2702,7 @@
     <w:qFormat/>
     <w:pPr>
       <w:widowControl/>
+      <w:suppressAutoHyphens w:val="true"/>
       <w:bidi w:val="0"/>
       <w:spacing w:before="0" w:after="0"/>
       <w:jc w:val="left"/>
@@ -2820,6 +2723,7 @@
     <w:qFormat/>
     <w:pPr>
       <w:widowControl/>
+      <w:suppressAutoHyphens w:val="true"/>
       <w:bidi w:val="0"/>
       <w:spacing w:before="0" w:after="0"/>
       <w:jc w:val="left"/>
@@ -2834,7 +2738,7 @@
     </w:rPr>
   </w:style>
   <w:style w:type="paragraph" w:styleId="FootnoteText">
-    <w:name w:val="Footnote Text"/>
+    <w:name w:val="footnote text"/>
     <w:basedOn w:val="Normal"/>
     <w:link w:val="FootnoteTextChar"/>
     <w:uiPriority w:val="99"/>
@@ -2849,7 +2753,7 @@
     </w:rPr>
   </w:style>
   <w:style w:type="paragraph" w:styleId="EndnoteText">
-    <w:name w:val="Endnote Text"/>
+    <w:name w:val="endnote text"/>
     <w:basedOn w:val="Normal"/>
     <w:link w:val="EndnoteTextChar"/>
     <w:uiPriority w:val="99"/>
@@ -2874,37 +2778,37 @@
         <a:srgbClr val="000000"/>
       </a:dk1>
       <a:lt1>
-        <a:srgbClr val="ffffff"/>
+        <a:srgbClr val="FFFFFF"/>
       </a:lt1>
       <a:dk2>
         <a:srgbClr val="000000"/>
       </a:dk2>
       <a:lt2>
-        <a:srgbClr val="ffffff"/>
+        <a:srgbClr val="FFFFFF"/>
       </a:lt2>
       <a:accent1>
-        <a:srgbClr val="18a303"/>
+        <a:srgbClr val="18A303"/>
       </a:accent1>
       <a:accent2>
-        <a:srgbClr val="0369a3"/>
+        <a:srgbClr val="0369A3"/>
       </a:accent2>
       <a:accent3>
-        <a:srgbClr val="a33e03"/>
+        <a:srgbClr val="A33E03"/>
       </a:accent3>
       <a:accent4>
-        <a:srgbClr val="8e03a3"/>
+        <a:srgbClr val="8E03A3"/>
       </a:accent4>
       <a:accent5>
-        <a:srgbClr val="c99c00"/>
+        <a:srgbClr val="C99C00"/>
       </a:accent5>
       <a:accent6>
-        <a:srgbClr val="c9211e"/>
+        <a:srgbClr val="C9211E"/>
       </a:accent6>
       <a:hlink>
-        <a:srgbClr val="0000ee"/>
+        <a:srgbClr val="0000EE"/>
       </a:hlink>
       <a:folHlink>
-        <a:srgbClr val="551a8b"/>
+        <a:srgbClr val="551A8B"/>
       </a:folHlink>
     </a:clrScheme>
     <a:fontScheme name="Office">

</xml_diff>